<commit_message>
ADS 3.º BTI: lote 4 v1.1 (cierre de auditoría): Práctica 11 reproducible
La Práctica 11 se ejecuta en una copia de práctica de la base del equipo, con
una correspondencia fija de las etiquetas de Mbokaja (MB-201 → EJ-0201), sin
cambiar la base Arapoty. Comprobación aislada practica_11/ (17 de 17) sobre una
base temporal. Las Prácticas 10, 12 y 13 dicen qué se ejecuta y qué se resuelve
en papel. Versión 1.0 conservada en lote_4/version_1_0/. Verificador 285/0,
impresión 26/0, fuentes 9/0.

Co-Authored-By: Claude Opus 5.5 <noreply@anthropic.com>
Claude-Session: https://claude.ai/code/session_01LqBrALZn8HbnzzUtvCFRMa
</commit_message>
<xml_diff>
--- a/analisis_diseno_3_bti/lote_4/ADS_3BTI_LOTE4_CUADERNO_PRACTICAS_OFICIO_O3.docx
+++ b/analisis_diseno_3_bti/lote_4/ADS_3BTI_LOTE4_CUADERNO_PRACTICAS_OFICIO_O3.docx
@@ -230,7 +230,7 @@
           <w:i w:val="0"/>
           <w:sz w:val="20"/>
         </w:rPr>
-        <w:t>Versión v1.0 (lote 4, para auditoría) · oficio O3</w:t>
+        <w:t>Versión v1.1 (lote 4, cierre de auditoría) · oficio O3</w:t>
       </w:r>
     </w:p>
     <w:p>
@@ -268,6 +268,20 @@
           <w:sz w:val="21"/>
         </w:rPr>
         <w:t>Seguís con la Escuela Básica Mbokaja, que ya tiene la computadora donada sin internet (M-F7). El profesor del colegio vecino dejó instalado un sistema de prueba con una copia de la base del curso (M-F10). En la escuela nadie sabe instalar programas (M-F9), y los libros tienen etiquetas propias (M-F11).</w:t>
+      </w:r>
+    </w:p>
+    <w:p>
+      <w:pPr>
+        <w:spacing w:before="0" w:after="80"/>
+        <w:jc w:val="both"/>
+      </w:pPr>
+      <w:r>
+        <w:rPr>
+          <w:b w:val="0"/>
+          <w:i w:val="0"/>
+          <w:sz w:val="21"/>
+        </w:rPr>
+        <w:t>Los niveles 1 y 2 se hacen en una copia de práctica de la base de tu equipo, instalada en otra carpeta: el sistema de prueba de Mbokaja es una copia como esa. El nivel 3 se resuelve en papel.</w:t>
       </w:r>
     </w:p>
     <w:p>
@@ -1128,7 +1142,21 @@
           <w:i w:val="0"/>
           <w:sz w:val="21"/>
         </w:rPr>
-        <w:t>En Mbokaja llegó un lote de libros donados, cargado en una planilla por un voluntario. También hay lectores nuevos para registrar. Para esta práctica, el sistema de prueba de Mbokaja ya acepta las etiquetas MB- y tres cifras (M-F11): el profesor vecino adaptó la validación y la restricción de la base. Los datos tienen errores que hay que resolver antes de cargarlos, o que el sistema tiene que rechazar.</w:t>
+        <w:t>En Mbokaja llegó un lote de libros donados, cargado en una planilla por un voluntario. También hay lectores nuevos para registrar. Los datos tienen errores que hay que resolver antes de cargarlos, o que el sistema tiene que rechazar.</w:t>
+      </w:r>
+    </w:p>
+    <w:p>
+      <w:pPr>
+        <w:spacing w:before="0" w:after="80"/>
+        <w:jc w:val="both"/>
+      </w:pPr>
+      <w:r>
+        <w:rPr>
+          <w:b w:val="0"/>
+          <w:i w:val="0"/>
+          <w:sz w:val="21"/>
+        </w:rPr>
+        <w:t>Se trabaja en una copia de práctica: instalá la base de tu equipo en otra carpeta, con php instalar.php, y cargá ahí los datos. No se cambia la base de la clase. El sistema entregado valida códigos EJ- y cuatro cifras, y los libros de Mbokaja tienen etiquetas MB- y tres cifras (M-F11): por eso se cargan con la correspondencia fija de la tabla de abajo. Si tu equipo todavía no construyó OA-01 a OA-03, tu docente hace la carga en una copia de la referencia.</w:t>
       </w:r>
     </w:p>
     <w:p>
@@ -2142,6 +2170,713 @@
     </w:p>
     <w:p>
       <w:pPr>
+        <w:keepNext/>
+        <w:spacing w:before="0" w:after="80"/>
+        <w:jc w:val="both"/>
+      </w:pPr>
+      <w:r>
+        <w:rPr>
+          <w:b/>
+          <w:i w:val="0"/>
+          <w:color w:val="1B5E20"/>
+          <w:sz w:val="20"/>
+        </w:rPr>
+        <w:t>Cómo se cargan los datos de Mbokaja en la copia de práctica (correspondencia fija)</w:t>
+      </w:r>
+    </w:p>
+    <w:tbl>
+      <w:tblPr>
+        <w:jc w:val="center"/>
+        <w:tblLook w:firstColumn="1" w:firstRow="1" w:lastColumn="0" w:lastRow="0" w:noHBand="0" w:noVBand="1" w:val="04A0"/>
+        <w:tblBorders>
+          <w:top w:val="single" w:sz="4" w:space="0" w:color="BFBFBF"/>
+          <w:left w:val="single" w:sz="4" w:space="0" w:color="BFBFBF"/>
+          <w:bottom w:val="single" w:sz="4" w:space="0" w:color="BFBFBF"/>
+          <w:right w:val="single" w:sz="4" w:space="0" w:color="BFBFBF"/>
+          <w:insideH w:val="single" w:sz="4" w:space="0" w:color="BFBFBF"/>
+          <w:insideV w:val="single" w:sz="4" w:space="0" w:color="BFBFBF"/>
+        </w:tblBorders>
+        <w:tblW w:w="9802" w:type="dxa"/>
+        <w:tblLayout w:type="fixed"/>
+      </w:tblPr>
+      <w:tblGrid>
+        <w:gridCol w:w="2716"/>
+        <w:gridCol w:w="3307"/>
+        <w:gridCol w:w="3779"/>
+      </w:tblGrid>
+      <w:tr>
+        <w:trPr>
+          <w:cantSplit/>
+          <w:tblHeader/>
+        </w:trPr>
+        <w:tc>
+          <w:tcPr>
+            <w:tcW w:type="dxa" w:w="2716"/>
+            <w:shd w:val="clear" w:color="auto" w:fill="2E7D32"/>
+          </w:tcPr>
+          <w:p>
+            <w:pPr>
+              <w:keepNext/>
+            </w:pPr>
+            <w:r>
+              <w:rPr>
+                <w:b/>
+                <w:color w:val="FFFFFF"/>
+                <w:sz w:val="18"/>
+              </w:rPr>
+              <w:t>Dato de Mbokaja</w:t>
+            </w:r>
+          </w:p>
+        </w:tc>
+        <w:tc>
+          <w:tcPr>
+            <w:tcW w:type="dxa" w:w="3307"/>
+            <w:shd w:val="clear" w:color="auto" w:fill="2E7D32"/>
+          </w:tcPr>
+          <w:p>
+            <w:pPr>
+              <w:keepNext/>
+            </w:pPr>
+            <w:r>
+              <w:rPr>
+                <w:b/>
+                <w:color w:val="FFFFFF"/>
+                <w:sz w:val="18"/>
+              </w:rPr>
+              <w:t>Cómo se escribe en la copia de práctica</w:t>
+            </w:r>
+          </w:p>
+        </w:tc>
+        <w:tc>
+          <w:tcPr>
+            <w:tcW w:type="dxa" w:w="3779"/>
+            <w:shd w:val="clear" w:color="auto" w:fill="2E7D32"/>
+          </w:tcPr>
+          <w:p>
+            <w:pPr>
+              <w:keepNext/>
+            </w:pPr>
+            <w:r>
+              <w:rPr>
+                <w:b/>
+                <w:color w:val="FFFFFF"/>
+                <w:sz w:val="18"/>
+              </w:rPr>
+              <w:t>Por qué</w:t>
+            </w:r>
+          </w:p>
+        </w:tc>
+      </w:tr>
+      <w:tr>
+        <w:trPr>
+          <w:cantSplit/>
+        </w:trPr>
+        <w:tc>
+          <w:tcPr>
+            <w:tcW w:type="dxa" w:w="2716"/>
+          </w:tcPr>
+          <w:p>
+            <w:pPr>
+              <w:keepNext/>
+            </w:pPr>
+            <w:r>
+              <w:rPr>
+                <w:sz w:val="18"/>
+              </w:rPr>
+              <w:t>Etiqueta MB- y tres cifras (por ejemplo, MB-201)</w:t>
+            </w:r>
+          </w:p>
+        </w:tc>
+        <w:tc>
+          <w:tcPr>
+            <w:tcW w:type="dxa" w:w="3307"/>
+          </w:tcPr>
+          <w:p>
+            <w:pPr>
+              <w:keepNext/>
+            </w:pPr>
+            <w:r>
+              <w:rPr>
+                <w:sz w:val="18"/>
+              </w:rPr>
+              <w:t>EJ-0 y las mismas tres cifras (EJ-0201)</w:t>
+            </w:r>
+          </w:p>
+        </w:tc>
+        <w:tc>
+          <w:tcPr>
+            <w:tcW w:type="dxa" w:w="3779"/>
+          </w:tcPr>
+          <w:p>
+            <w:pPr>
+              <w:keepNext/>
+            </w:pPr>
+            <w:r>
+              <w:rPr>
+                <w:sz w:val="18"/>
+              </w:rPr>
+              <w:t>El sistema entregado valida EJ- y cuatro cifras; la correspondencia conserva las cifras de la etiqueta.</w:t>
+            </w:r>
+          </w:p>
+        </w:tc>
+      </w:tr>
+      <w:tr>
+        <w:trPr>
+          <w:cantSplit/>
+        </w:trPr>
+        <w:tc>
+          <w:tcPr>
+            <w:tcW w:type="dxa" w:w="2716"/>
+            <w:shd w:val="clear" w:color="auto" w:fill="F5F5F5"/>
+          </w:tcPr>
+          <w:p>
+            <w:pPr>
+              <w:keepNext/>
+            </w:pPr>
+            <w:r>
+              <w:rPr>
+                <w:sz w:val="18"/>
+              </w:rPr>
+              <w:t>Etiqueta con otro formato (MB205)</w:t>
+            </w:r>
+          </w:p>
+        </w:tc>
+        <w:tc>
+          <w:tcPr>
+            <w:tcW w:type="dxa" w:w="3307"/>
+            <w:shd w:val="clear" w:color="auto" w:fill="F5F5F5"/>
+          </w:tcPr>
+          <w:p>
+            <w:pPr>
+              <w:keepNext/>
+            </w:pPr>
+            <w:r>
+              <w:rPr>
+                <w:sz w:val="18"/>
+              </w:rPr>
+              <w:t>Tal como figura en la planilla (MB205)</w:t>
+            </w:r>
+          </w:p>
+        </w:tc>
+        <w:tc>
+          <w:tcPr>
+            <w:tcW w:type="dxa" w:w="3779"/>
+            <w:shd w:val="clear" w:color="auto" w:fill="F5F5F5"/>
+          </w:tcPr>
+          <w:p>
+            <w:pPr>
+              <w:keepNext/>
+            </w:pPr>
+            <w:r>
+              <w:rPr>
+                <w:sz w:val="18"/>
+              </w:rPr>
+              <w:t>Para ver qué responde el sistema.</w:t>
+            </w:r>
+          </w:p>
+        </w:tc>
+      </w:tr>
+      <w:tr>
+        <w:trPr>
+          <w:cantSplit/>
+        </w:trPr>
+        <w:tc>
+          <w:tcPr>
+            <w:tcW w:type="dxa" w:w="2716"/>
+          </w:tcPr>
+          <w:p>
+            <w:r>
+              <w:rPr>
+                <w:sz w:val="18"/>
+              </w:rPr>
+              <w:t>Obra «La laguna de los patos»</w:t>
+            </w:r>
+          </w:p>
+        </w:tc>
+        <w:tc>
+          <w:tcPr>
+            <w:tcW w:type="dxa" w:w="3307"/>
+          </w:tcPr>
+          <w:p>
+            <w:r>
+              <w:rPr>
+                <w:sz w:val="18"/>
+              </w:rPr>
+              <w:t>Obra OB-0210, edición ED-0210</w:t>
+            </w:r>
+          </w:p>
+        </w:tc>
+        <w:tc>
+          <w:tcPr>
+            <w:tcW w:type="dxa" w:w="3779"/>
+          </w:tcPr>
+          <w:p>
+            <w:r>
+              <w:rPr>
+                <w:sz w:val="18"/>
+              </w:rPr>
+              <w:t>Códigos asignados por el encargado.</w:t>
+            </w:r>
+          </w:p>
+        </w:tc>
+      </w:tr>
+      <w:tr>
+        <w:trPr>
+          <w:cantSplit/>
+        </w:trPr>
+        <w:tc>
+          <w:tcPr>
+            <w:tcW w:type="dxa" w:w="2716"/>
+            <w:shd w:val="clear" w:color="auto" w:fill="F5F5F5"/>
+          </w:tcPr>
+          <w:p>
+            <w:r>
+              <w:rPr>
+                <w:sz w:val="18"/>
+              </w:rPr>
+              <w:t>Obra «Canciones del recreo»</w:t>
+            </w:r>
+          </w:p>
+        </w:tc>
+        <w:tc>
+          <w:tcPr>
+            <w:tcW w:type="dxa" w:w="3307"/>
+            <w:shd w:val="clear" w:color="auto" w:fill="F5F5F5"/>
+          </w:tcPr>
+          <w:p>
+            <w:r>
+              <w:rPr>
+                <w:sz w:val="18"/>
+              </w:rPr>
+              <w:t>Obra OB-0220, edición ED-0220</w:t>
+            </w:r>
+          </w:p>
+        </w:tc>
+        <w:tc>
+          <w:tcPr>
+            <w:tcW w:type="dxa" w:w="3779"/>
+            <w:shd w:val="clear" w:color="auto" w:fill="F5F5F5"/>
+          </w:tcPr>
+          <w:p>
+            <w:r>
+              <w:rPr>
+                <w:sz w:val="18"/>
+              </w:rPr>
+              <w:t>Códigos asignados por el encargado.</w:t>
+            </w:r>
+          </w:p>
+        </w:tc>
+      </w:tr>
+      <w:tr>
+        <w:trPr>
+          <w:cantSplit/>
+        </w:trPr>
+        <w:tc>
+          <w:tcPr>
+            <w:tcW w:type="dxa" w:w="2716"/>
+          </w:tcPr>
+          <w:p>
+            <w:r>
+              <w:rPr>
+                <w:sz w:val="18"/>
+              </w:rPr>
+              <w:t>Obra «Mapas de mi país»</w:t>
+            </w:r>
+          </w:p>
+        </w:tc>
+        <w:tc>
+          <w:tcPr>
+            <w:tcW w:type="dxa" w:w="3307"/>
+          </w:tcPr>
+          <w:p>
+            <w:r>
+              <w:rPr>
+                <w:sz w:val="18"/>
+              </w:rPr>
+              <w:t>Obra OB-0230, edición ED-0230</w:t>
+            </w:r>
+          </w:p>
+        </w:tc>
+        <w:tc>
+          <w:tcPr>
+            <w:tcW w:type="dxa" w:w="3779"/>
+          </w:tcPr>
+          <w:p>
+            <w:r>
+              <w:rPr>
+                <w:sz w:val="18"/>
+              </w:rPr>
+              <w:t>Códigos asignados por el encargado.</w:t>
+            </w:r>
+          </w:p>
+        </w:tc>
+      </w:tr>
+      <w:tr>
+        <w:trPr>
+          <w:cantSplit/>
+        </w:trPr>
+        <w:tc>
+          <w:tcPr>
+            <w:tcW w:type="dxa" w:w="2716"/>
+            <w:shd w:val="clear" w:color="auto" w:fill="F5F5F5"/>
+          </w:tcPr>
+          <w:p>
+            <w:pPr>
+              <w:keepNext/>
+            </w:pPr>
+            <w:r>
+              <w:rPr>
+                <w:sz w:val="18"/>
+              </w:rPr>
+              <w:t>Editorial y año de las donaciones</w:t>
+            </w:r>
+          </w:p>
+        </w:tc>
+        <w:tc>
+          <w:tcPr>
+            <w:tcW w:type="dxa" w:w="3307"/>
+            <w:shd w:val="clear" w:color="auto" w:fill="F5F5F5"/>
+          </w:tcPr>
+          <w:p>
+            <w:pPr>
+              <w:keepNext/>
+            </w:pPr>
+            <w:r>
+              <w:rPr>
+                <w:sz w:val="18"/>
+              </w:rPr>
+              <w:t>«Donación Mbokaja»</w:t>
+            </w:r>
+          </w:p>
+        </w:tc>
+        <w:tc>
+          <w:tcPr>
+            <w:tcW w:type="dxa" w:w="3779"/>
+            <w:shd w:val="clear" w:color="auto" w:fill="F5F5F5"/>
+          </w:tcPr>
+          <w:p>
+            <w:pPr>
+              <w:keepNext/>
+            </w:pPr>
+            <w:r>
+              <w:rPr>
+                <w:sz w:val="18"/>
+              </w:rPr>
+              <w:t>La planilla no los trae.</w:t>
+            </w:r>
+          </w:p>
+        </w:tc>
+      </w:tr>
+      <w:tr>
+        <w:trPr>
+          <w:cantSplit/>
+        </w:trPr>
+        <w:tc>
+          <w:tcPr>
+            <w:tcW w:type="dxa" w:w="2716"/>
+          </w:tcPr>
+          <w:p>
+            <w:r>
+              <w:rPr>
+                <w:sz w:val="18"/>
+              </w:rPr>
+              <w:t>Lectores ML-1, ML-2 y ML-3</w:t>
+            </w:r>
+          </w:p>
+        </w:tc>
+        <w:tc>
+          <w:tcPr>
+            <w:tcW w:type="dxa" w:w="3307"/>
+          </w:tcPr>
+          <w:p>
+            <w:r>
+              <w:rPr>
+                <w:sz w:val="18"/>
+              </w:rPr>
+              <w:t>LE-0301, LE-0302 y LE-0303, con el nombre «Lector ML-1 (ficticio)» y así</w:t>
+            </w:r>
+          </w:p>
+        </w:tc>
+        <w:tc>
+          <w:tcPr>
+            <w:tcW w:type="dxa" w:w="3779"/>
+          </w:tcPr>
+          <w:p>
+            <w:r>
+              <w:rPr>
+                <w:sz w:val="18"/>
+              </w:rPr>
+              <w:t>Datos ficticios; el sistema no guarda datos personales reales.</w:t>
+            </w:r>
+          </w:p>
+        </w:tc>
+      </w:tr>
+    </w:tbl>
+    <w:p>
+      <w:pPr>
+        <w:spacing w:after="40"/>
+      </w:pPr>
+    </w:p>
+    <w:p>
+      <w:pPr>
+        <w:keepNext/>
+        <w:spacing w:before="0" w:after="80"/>
+        <w:jc w:val="both"/>
+      </w:pPr>
+      <w:r>
+        <w:rPr>
+          <w:b/>
+          <w:i w:val="0"/>
+          <w:color w:val="1B5E20"/>
+          <w:sz w:val="20"/>
+        </w:rPr>
+        <w:t>Qué se ejecuta en la copia de práctica y qué se resuelve en papel</w:t>
+      </w:r>
+    </w:p>
+    <w:tbl>
+      <w:tblPr>
+        <w:jc w:val="center"/>
+        <w:tblLook w:firstColumn="1" w:firstRow="1" w:lastColumn="0" w:lastRow="0" w:noHBand="0" w:noVBand="1" w:val="04A0"/>
+        <w:tblBorders>
+          <w:top w:val="single" w:sz="4" w:space="0" w:color="BFBFBF"/>
+          <w:left w:val="single" w:sz="4" w:space="0" w:color="BFBFBF"/>
+          <w:bottom w:val="single" w:sz="4" w:space="0" w:color="BFBFBF"/>
+          <w:right w:val="single" w:sz="4" w:space="0" w:color="BFBFBF"/>
+          <w:insideH w:val="single" w:sz="4" w:space="0" w:color="BFBFBF"/>
+          <w:insideV w:val="single" w:sz="4" w:space="0" w:color="BFBFBF"/>
+        </w:tblBorders>
+        <w:tblW w:w="9803" w:type="dxa"/>
+        <w:tblLayout w:type="fixed"/>
+      </w:tblPr>
+      <w:tblGrid>
+        <w:gridCol w:w="1299"/>
+        <w:gridCol w:w="2953"/>
+        <w:gridCol w:w="5551"/>
+      </w:tblGrid>
+      <w:tr>
+        <w:trPr>
+          <w:cantSplit/>
+          <w:tblHeader/>
+        </w:trPr>
+        <w:tc>
+          <w:tcPr>
+            <w:tcW w:type="dxa" w:w="1299"/>
+            <w:shd w:val="clear" w:color="auto" w:fill="2E7D32"/>
+          </w:tcPr>
+          <w:p>
+            <w:pPr>
+              <w:keepNext/>
+            </w:pPr>
+            <w:r>
+              <w:rPr>
+                <w:b/>
+                <w:color w:val="FFFFFF"/>
+                <w:sz w:val="18"/>
+              </w:rPr>
+              <w:t>Nivel</w:t>
+            </w:r>
+          </w:p>
+        </w:tc>
+        <w:tc>
+          <w:tcPr>
+            <w:tcW w:type="dxa" w:w="2953"/>
+            <w:shd w:val="clear" w:color="auto" w:fill="2E7D32"/>
+          </w:tcPr>
+          <w:p>
+            <w:pPr>
+              <w:keepNext/>
+            </w:pPr>
+            <w:r>
+              <w:rPr>
+                <w:b/>
+                <w:color w:val="FFFFFF"/>
+                <w:sz w:val="18"/>
+              </w:rPr>
+              <w:t>Dónde se hace</w:t>
+            </w:r>
+          </w:p>
+        </w:tc>
+        <w:tc>
+          <w:tcPr>
+            <w:tcW w:type="dxa" w:w="5551"/>
+            <w:shd w:val="clear" w:color="auto" w:fill="2E7D32"/>
+          </w:tcPr>
+          <w:p>
+            <w:pPr>
+              <w:keepNext/>
+            </w:pPr>
+            <w:r>
+              <w:rPr>
+                <w:b/>
+                <w:color w:val="FFFFFF"/>
+                <w:sz w:val="18"/>
+              </w:rPr>
+              <w:t>Qué se hace</w:t>
+            </w:r>
+          </w:p>
+        </w:tc>
+      </w:tr>
+      <w:tr>
+        <w:trPr>
+          <w:cantSplit/>
+        </w:trPr>
+        <w:tc>
+          <w:tcPr>
+            <w:tcW w:type="dxa" w:w="1299"/>
+          </w:tcPr>
+          <w:p>
+            <w:pPr>
+              <w:keepNext/>
+            </w:pPr>
+            <w:r>
+              <w:rPr>
+                <w:sz w:val="18"/>
+              </w:rPr>
+              <w:t>Nivel 1</w:t>
+            </w:r>
+          </w:p>
+        </w:tc>
+        <w:tc>
+          <w:tcPr>
+            <w:tcW w:type="dxa" w:w="2953"/>
+          </w:tcPr>
+          <w:p>
+            <w:pPr>
+              <w:keepNext/>
+            </w:pPr>
+            <w:r>
+              <w:rPr>
+                <w:sz w:val="18"/>
+              </w:rPr>
+              <w:t>En papel, y después se comprueba en la copia</w:t>
+            </w:r>
+          </w:p>
+        </w:tc>
+        <w:tc>
+          <w:tcPr>
+            <w:tcW w:type="dxa" w:w="5551"/>
+          </w:tcPr>
+          <w:p>
+            <w:pPr>
+              <w:keepNext/>
+            </w:pPr>
+            <w:r>
+              <w:rPr>
+                <w:sz w:val="18"/>
+              </w:rPr>
+              <w:t>Clasificar cada fila y prever el mensaje; luego cargar las filas tal cual y comparar.</w:t>
+            </w:r>
+          </w:p>
+        </w:tc>
+      </w:tr>
+      <w:tr>
+        <w:trPr>
+          <w:cantSplit/>
+        </w:trPr>
+        <w:tc>
+          <w:tcPr>
+            <w:tcW w:type="dxa" w:w="1299"/>
+            <w:shd w:val="clear" w:color="auto" w:fill="F5F5F5"/>
+          </w:tcPr>
+          <w:p>
+            <w:pPr>
+              <w:keepNext/>
+            </w:pPr>
+            <w:r>
+              <w:rPr>
+                <w:sz w:val="18"/>
+              </w:rPr>
+              <w:t>Nivel 2</w:t>
+            </w:r>
+          </w:p>
+        </w:tc>
+        <w:tc>
+          <w:tcPr>
+            <w:tcW w:type="dxa" w:w="2953"/>
+            <w:shd w:val="clear" w:color="auto" w:fill="F5F5F5"/>
+          </w:tcPr>
+          <w:p>
+            <w:pPr>
+              <w:keepNext/>
+            </w:pPr>
+            <w:r>
+              <w:rPr>
+                <w:sz w:val="18"/>
+              </w:rPr>
+              <w:t>Se ejecuta en la copia de práctica</w:t>
+            </w:r>
+          </w:p>
+        </w:tc>
+        <w:tc>
+          <w:tcPr>
+            <w:tcW w:type="dxa" w:w="5551"/>
+            <w:shd w:val="clear" w:color="auto" w:fill="F5F5F5"/>
+          </w:tcPr>
+          <w:p>
+            <w:pPr>
+              <w:keepNext/>
+            </w:pPr>
+            <w:r>
+              <w:rPr>
+                <w:sz w:val="18"/>
+              </w:rPr>
+              <w:t>Cargar el lote corregido con la correspondencia y comprobar con la consulta pública.</w:t>
+            </w:r>
+          </w:p>
+        </w:tc>
+      </w:tr>
+      <w:tr>
+        <w:trPr>
+          <w:cantSplit/>
+        </w:trPr>
+        <w:tc>
+          <w:tcPr>
+            <w:tcW w:type="dxa" w:w="1299"/>
+          </w:tcPr>
+          <w:p>
+            <w:r>
+              <w:rPr>
+                <w:sz w:val="18"/>
+              </w:rPr>
+              <w:t>Nivel 3</w:t>
+            </w:r>
+          </w:p>
+        </w:tc>
+        <w:tc>
+          <w:tcPr>
+            <w:tcW w:type="dxa" w:w="2953"/>
+          </w:tcPr>
+          <w:p>
+            <w:r>
+              <w:rPr>
+                <w:sz w:val="18"/>
+              </w:rPr>
+              <w:t>En papel (diseño)</w:t>
+            </w:r>
+          </w:p>
+        </w:tc>
+        <w:tc>
+          <w:tcPr>
+            <w:tcW w:type="dxa" w:w="5551"/>
+          </w:tcPr>
+          <w:p>
+            <w:r>
+              <w:rPr>
+                <w:sz w:val="18"/>
+              </w:rPr>
+              <w:t>El sistema entregado no tiene un rol de voluntario: se decide y se diseña la prueba, sin programarla.</w:t>
+            </w:r>
+          </w:p>
+        </w:tc>
+      </w:tr>
+    </w:tbl>
+    <w:p>
+      <w:pPr>
+        <w:spacing w:after="40"/>
+      </w:pPr>
+    </w:p>
+    <w:p>
+      <w:pPr>
         <w:pStyle w:val="Heading3"/>
       </w:pPr>
       <w:r>
@@ -2174,7 +2909,7 @@
           <w:i w:val="0"/>
           <w:sz w:val="20"/>
         </w:rPr>
-        <w:t>1. Para cada fila del lote (MD-01 a MD-06), decidí: se registra tal cual, se corrige antes de registrar, o el sistema la rechaza. Escribí el mensaje que esperás en cada rechazo.</w:t>
+        <w:t>1. Para cada fila del lote (MD-01 a MD-06), decidí en papel: se registra tal cual, se corrige antes de registrar, o el sistema la rechaza. Escribí el mensaje que esperás en cada rechazo.</w:t>
       </w:r>
     </w:p>
     <w:p>
@@ -2219,7 +2954,7 @@
           <w:i w:val="0"/>
           <w:sz w:val="20"/>
         </w:rPr>
-        <w:t>2. Para cada lector (ML-1 a ML-3), escribí si se registra y, si no, qué mensaje responde y qué dato hay que pedir.</w:t>
+        <w:t>2. Para cada lector (ML-1 a ML-3), escribí si se registra y, si no, qué mensaje responde y qué dato hay que pedir. Después cargá en la copia de práctica las filas que previste como rechazos y anotá el mensaje obtenido.</w:t>
       </w:r>
     </w:p>
     <w:p>
@@ -2330,7 +3065,7 @@
           <w:i w:val="0"/>
           <w:sz w:val="20"/>
         </w:rPr>
-        <w:t>2. Registrá el lote corregido en la copia de la base y comprobá con la consulta pública cuántos disponibles hay de cada título. Anotá esperado y obtenido.</w:t>
+        <w:t>2. Cargá el lote corregido en la copia de práctica, con la correspondencia fija, y comprobá con la consulta pública cuántos ejemplares y disponibles hay de «laguna», «Canciones» y «Mapas». Anotá esperado y obtenido, y explicá cualquier diferencia.</w:t>
       </w:r>
     </w:p>
     <w:p>
@@ -2367,7 +3102,7 @@
         <w:pStyle w:val="Heading3"/>
       </w:pPr>
       <w:r>
-        <w:t>Nivel 3 — Ampliación</w:t>
+        <w:t>Nivel 3 — Ampliación (en papel)</w:t>
       </w:r>
     </w:p>
     <w:p>
@@ -2396,7 +3131,7 @@
           <w:i w:val="0"/>
           <w:sz w:val="20"/>
         </w:rPr>
-        <w:t>1. Los voluntarios de 9.º ayudan los miércoles con el encargado presente (MS-5). Decidí qué pueden hacer en el sistema y cómo se comprueba en el servidor. Tené en cuenta que son menores de edad y que no tienen que ver datos de otros estudiantes (MN-05).</w:t>
+        <w:t>1. Los voluntarios de 9.º ayudan los miércoles con el encargado presente (MS-5). Decidí qué pueden hacer en el sistema y cómo se comprobaría en el servidor. Tené en cuenta que son menores de edad y que no tienen que ver datos de otros estudiantes (MN-05). El sistema entregado no tiene un rol de voluntario: no se programa.</w:t>
       </w:r>
     </w:p>
     <w:p>
@@ -2441,7 +3176,7 @@
           <w:i w:val="0"/>
           <w:sz w:val="20"/>
         </w:rPr>
-        <w:t>2. Escribí la prueba que demuestra tu decisión, con la cuenta, la operación y el mensaje esperado.</w:t>
+        <w:t>2. Escribí la prueba que demostraría tu decisión, con la cuenta, la operación y el mensaje esperado.</w:t>
       </w:r>
     </w:p>
     <w:p>
@@ -2517,7 +3252,7 @@
               <w:rPr>
                 <w:sz w:val="20"/>
               </w:rPr>
-              <w:t>Punto de control: ningún código repetido se registra; el título mal escrito no crea una obra nueva; el estudiante sin curso y el docente con curso se rechazan con su mensaje; los voluntarios no comparten la cuenta del encargado ni ven datos de lectores; cada decisión tiene su prueba.</w:t>
+              <w:t>Punto de control: la carga se hace en la copia de práctica, con la correspondencia fija; ningún código repetido se registra; el título mal escrito no crea una obra nueva; el estudiante sin curso y el docente con curso se rechazan con su mensaje; los voluntarios no comparten la cuenta del encargado ni ven datos de lectores; cada decisión tiene su prueba.</w:t>
             </w:r>
           </w:p>
         </w:tc>
@@ -2544,6 +3279,20 @@
           <w:sz w:val="21"/>
         </w:rPr>
         <w:t>En Mbokaja, un miércoles, dos voluntarios cargaron al mismo tiempo, en dos computadoras, el mismo libro para dos lectores distintos (MS-6). Ese mismo día volvió un libro con hojas arrancadas (MS-1), y la norma dice que se repone con otro igual (M-N5). Usá el contrato de devolución que escribiste en la Práctica 9.</w:t>
+      </w:r>
+    </w:p>
+    <w:p>
+      <w:pPr>
+        <w:spacing w:before="0" w:after="80"/>
+        <w:jc w:val="both"/>
+      </w:pPr>
+      <w:r>
+        <w:rPr>
+          <w:b w:val="0"/>
+          <w:i w:val="0"/>
+          <w:sz w:val="21"/>
+        </w:rPr>
+        <w:t>Esta práctica se resuelve en papel: se explica, se diseña la prueba y se decide. No hace falta ejecutar nada en la computadora de Mbokaja.</w:t>
       </w:r>
     </w:p>
     <w:p>
@@ -3291,6 +4040,20 @@
           <w:sz w:val="21"/>
         </w:rPr>
         <w:t>Esta práctica no figura en el índice de Work: es un complemento editorial breve, para el Encuentro 25 o como actividad complementaria. No reemplaza ni reduce el H4. El sistema de prueba de Mbokaja se usó una semana, con plazo de siete días (M-N1). El encargado anotó lo que pasó (MI-01 a MI-07). Algunos resultados del sistema no coinciden con lo que pasó: hay que descubrir por qué.</w:t>
+      </w:r>
+    </w:p>
+    <w:p>
+      <w:pPr>
+        <w:spacing w:before="0" w:after="80"/>
+        <w:jc w:val="both"/>
+      </w:pPr>
+      <w:r>
+        <w:rPr>
+          <w:b w:val="0"/>
+          <w:i w:val="0"/>
+          <w:sz w:val="21"/>
+        </w:rPr>
+        <w:t>El registro de la semana y lo que mostró el sistema de Mbokaja son datos simulados: la práctica se resuelve en papel, a partir del registro, y no se reproduce en la base entregada.</w:t>
       </w:r>
     </w:p>
     <w:p>

</xml_diff>